<commit_message>
new favicon; ch5 conclusion; moved bible xml
</commit_message>
<xml_diff>
--- a/draft/ch5-draft.docx
+++ b/draft/ch5-draft.docx
@@ -838,7 +838,20 @@
         <w:rPr>
           <w:rFonts w:ascii="Liberation Serif" w:hAnsi="Liberation Serif"/>
         </w:rPr>
-        <w:t>], as the novel’s top word is relatively unpopular (137th) in the Bible, but its twenty-second most common word, “son” [</w:t>
+        <w:t>], as the novel’s top word is relatively unpopular (137</w:t>
+      </w:r>
+      <w:r>
+        <w:rPr>
+          <w:rFonts w:ascii="Liberation Serif" w:hAnsi="Liberation Serif"/>
+          <w:vertAlign w:val="superscript"/>
+        </w:rPr>
+        <w:t>th</w:t>
+      </w:r>
+      <w:r>
+        <w:rPr>
+          <w:rFonts w:ascii="Liberation Serif" w:hAnsi="Liberation Serif"/>
+        </w:rPr>
+        <w:t>) in the Bible, but its twenty-second most common word, “son” [</w:t>
       </w:r>
       <w:r>
         <w:rPr>
@@ -1141,7 +1154,33 @@
         <w:rPr>
           <w:rFonts w:ascii="Liberation Serif" w:hAnsi="Liberation Serif"/>
         </w:rPr>
-        <w:t>] (331st, as opposed to first in the Bible), “God” (130th, as opposed to fourth), and “father” [</w:t>
+        <w:t>] (331</w:t>
+      </w:r>
+      <w:r>
+        <w:rPr>
+          <w:rFonts w:ascii="Liberation Serif" w:hAnsi="Liberation Serif"/>
+          <w:vertAlign w:val="superscript"/>
+        </w:rPr>
+        <w:t>st</w:t>
+      </w:r>
+      <w:r>
+        <w:rPr>
+          <w:rFonts w:ascii="Liberation Serif" w:hAnsi="Liberation Serif"/>
+        </w:rPr>
+        <w:t>, as opposed to first in the Bible), “God” (130</w:t>
+      </w:r>
+      <w:r>
+        <w:rPr>
+          <w:rFonts w:ascii="Liberation Serif" w:hAnsi="Liberation Serif"/>
+          <w:vertAlign w:val="superscript"/>
+        </w:rPr>
+        <w:t>th</w:t>
+      </w:r>
+      <w:r>
+        <w:rPr>
+          <w:rFonts w:ascii="Liberation Serif" w:hAnsi="Liberation Serif"/>
+        </w:rPr>
+        <w:t>, as opposed to fourth), and “father” [</w:t>
       </w:r>
       <w:r>
         <w:rPr>
@@ -1155,7 +1194,20 @@
         <w:rPr>
           <w:rFonts w:ascii="Liberation Serif" w:hAnsi="Liberation Serif"/>
         </w:rPr>
-        <w:t xml:space="preserve">] (229th, as opposed to fourteenth). </w:t>
+        <w:t>] (229</w:t>
+      </w:r>
+      <w:r>
+        <w:rPr>
+          <w:rFonts w:ascii="Liberation Serif" w:hAnsi="Liberation Serif"/>
+          <w:vertAlign w:val="superscript"/>
+        </w:rPr>
+        <w:t>th</w:t>
+      </w:r>
+      <w:r>
+        <w:rPr>
+          <w:rFonts w:ascii="Liberation Serif" w:hAnsi="Liberation Serif"/>
+        </w:rPr>
+        <w:t xml:space="preserve">, as opposed to fourteenth). </w:t>
       </w:r>
       <w:r>
         <w:rPr>
@@ -1171,15 +1223,7 @@
           <w:i w:val="false"/>
           <w:iCs w:val="false"/>
         </w:rPr>
-        <w:t xml:space="preserve"> </w:t>
-      </w:r>
-      <w:r>
-        <w:rPr>
-          <w:rFonts w:ascii="Liberation Serif" w:hAnsi="Liberation Serif"/>
-          <w:i w:val="false"/>
-          <w:iCs w:val="false"/>
-        </w:rPr>
-        <w:t>dee</w:t>
+        <w:t xml:space="preserve"> dee</w:t>
       </w:r>
       <w:r>
         <w:rPr>
@@ -1193,19 +1237,7 @@
         <w:rPr>
           <w:rFonts w:ascii="Liberation Serif" w:hAnsi="Liberation Serif"/>
         </w:rPr>
-        <w:t>mphasizes “</w:t>
-      </w:r>
-      <w:r>
-        <w:rPr>
-          <w:rFonts w:ascii="Liberation Serif" w:hAnsi="Liberation Serif"/>
-        </w:rPr>
-        <w:t xml:space="preserve">son” </w:t>
-      </w:r>
-      <w:r>
-        <w:rPr>
-          <w:rFonts w:ascii="Liberation Serif" w:hAnsi="Liberation Serif"/>
-        </w:rPr>
-        <w:t>[</w:t>
+        <w:t>mphasizes “son” [</w:t>
       </w:r>
       <w:r>
         <w:rPr>
@@ -1219,7 +1251,20 @@
         <w:rPr>
           <w:rFonts w:ascii="Liberation Serif" w:hAnsi="Liberation Serif"/>
         </w:rPr>
-        <w:t>] (190th, as opposed to third), “home” [</w:t>
+        <w:t>] (190</w:t>
+      </w:r>
+      <w:r>
+        <w:rPr>
+          <w:rFonts w:ascii="Liberation Serif" w:hAnsi="Liberation Serif"/>
+          <w:vertAlign w:val="superscript"/>
+        </w:rPr>
+        <w:t>th</w:t>
+      </w:r>
+      <w:r>
+        <w:rPr>
+          <w:rFonts w:ascii="Liberation Serif" w:hAnsi="Liberation Serif"/>
+        </w:rPr>
+        <w:t>, as opposed to third), “home” [</w:t>
       </w:r>
       <w:r>
         <w:rPr>
@@ -1233,7 +1278,20 @@
         <w:rPr>
           <w:rFonts w:ascii="Liberation Serif" w:hAnsi="Liberation Serif"/>
         </w:rPr>
-        <w:t>] (365th, as opposed to eleventh), and “city” [</w:t>
+        <w:t>] (365</w:t>
+      </w:r>
+      <w:r>
+        <w:rPr>
+          <w:rFonts w:ascii="Liberation Serif" w:hAnsi="Liberation Serif"/>
+          <w:vertAlign w:val="superscript"/>
+        </w:rPr>
+        <w:t>th</w:t>
+      </w:r>
+      <w:r>
+        <w:rPr>
+          <w:rFonts w:ascii="Liberation Serif" w:hAnsi="Liberation Serif"/>
+        </w:rPr>
+        <w:t>, as opposed to eleventh), and “city” [</w:t>
       </w:r>
       <w:r>
         <w:rPr>
@@ -1247,7 +1305,34 @@
         <w:rPr>
           <w:rFonts w:ascii="Liberation Serif" w:hAnsi="Liberation Serif"/>
         </w:rPr>
-        <w:t xml:space="preserve">] (184th, as opposed to seventeenth). In this choice, we see Gor’kii’s earlier novel attempting to avoid fathers of all kinds, which I explained more thoroughly in Chapter 3. Similarly, the latter work’s focus on God-the-Father and the </w:t>
+        <w:t>] (184</w:t>
+      </w:r>
+      <w:r>
+        <w:rPr>
+          <w:rFonts w:ascii="Liberation Serif" w:hAnsi="Liberation Serif"/>
+          <w:vertAlign w:val="superscript"/>
+        </w:rPr>
+        <w:t>th</w:t>
+      </w:r>
+      <w:r>
+        <w:rPr>
+          <w:rFonts w:ascii="Liberation Serif" w:hAnsi="Liberation Serif"/>
+        </w:rPr>
+        <w:t xml:space="preserve">, as opposed to seventeenth). In this choice, we see Gor’kii’s earlier novel attempting to avoid fathers of all kinds, which I explained more thoroughly in Chapter 3. Similarly, </w:t>
+      </w:r>
+      <w:r>
+        <w:rPr>
+          <w:rFonts w:ascii="Liberation Serif" w:hAnsi="Liberation Serif"/>
+          <w:i/>
+          <w:iCs/>
+        </w:rPr>
+        <w:t>Confession</w:t>
+      </w:r>
+      <w:r>
+        <w:rPr>
+          <w:rFonts w:ascii="Liberation Serif" w:hAnsi="Liberation Serif"/>
+        </w:rPr>
+        <w:t xml:space="preserve">’s focus on God-the-Father and the </w:t>
       </w:r>
       <w:r>
         <w:rPr>
@@ -1293,24 +1378,8 @@
       <w:r>
         <w:rPr>
           <w:rFonts w:ascii="Liberation Serif" w:hAnsi="Liberation Serif"/>
-          <w:i/>
-          <w:iCs/>
-        </w:rPr>
-        <w:t>Mother</w:t>
-      </w:r>
-      <w:r>
-        <w:rPr>
-          <w:rFonts w:ascii="Liberation Serif" w:hAnsi="Liberation Serif"/>
-        </w:rPr>
-        <w:t xml:space="preserve"> and </w:t>
-      </w:r>
-      <w:r>
-        <w:rPr>
-          <w:rFonts w:ascii="Liberation Serif" w:hAnsi="Liberation Serif"/>
-          <w:i/>
-          <w:iCs/>
-        </w:rPr>
-        <w:t>Confession</w:t>
+        </w:rPr>
+        <w:t>the novels</w:t>
       </w:r>
       <w:r>
         <w:rPr>
@@ -1362,6 +1431,114 @@
           <w:rFonts w:ascii="Liberation Serif" w:hAnsi="Liberation Serif"/>
         </w:rPr>
         <w:t>. For future purposes in refining the program, more advanced techniques that include semantic context will be crucial to honing the algorithm’s work. Relying on authors to use the exact language, even when adding some flexibility with by deriving tokens’ lemmas, creates more problems than it solves. Additional approaches can be implemented to consider matches between windows based on similarity in meaning rather than the word itself.</w:t>
+      </w:r>
+    </w:p>
+    <w:p>
+      <w:pPr>
+        <w:pStyle w:val="Normal"/>
+        <w:spacing w:lineRule="auto" w:line="480"/>
+        <w:jc w:val="left"/>
+        <w:rPr>
+          <w:rFonts w:ascii="Liberation Serif" w:hAnsi="Liberation Serif"/>
+        </w:rPr>
+      </w:pPr>
+      <w:r>
+        <w:rPr>
+          <w:rFonts w:ascii="Liberation Serif" w:hAnsi="Liberation Serif"/>
+        </w:rPr>
+        <w:tab/>
+      </w:r>
+      <w:r>
+        <w:rPr>
+          <w:rFonts w:ascii="Liberation Serif" w:hAnsi="Liberation Serif"/>
+        </w:rPr>
+        <w:t xml:space="preserve">The barrier between programmatic analysis and textual complexity cannot be understated. The ability to understand the provenance of a text requires more than segmenting and counting lemmas. Recent developments in NLP and artificial intelligence (AI) offer promising new paths for tool development and analytical exploration. </w:t>
+      </w:r>
+      <w:r>
+        <w:rPr>
+          <w:rFonts w:ascii="Liberation Serif" w:hAnsi="Liberation Serif"/>
+        </w:rPr>
+        <w:t xml:space="preserve">Neural networks (NN) are mathematical models of information that take into account both content and context </w:t>
+      </w:r>
+      <w:r>
+        <w:rPr>
+          <w:rFonts w:ascii="Liberation Serif" w:hAnsi="Liberation Serif"/>
+        </w:rPr>
+        <w:t>to perform “deep learning” of a concept</w:t>
+      </w:r>
+      <w:r>
+        <w:rPr>
+          <w:rFonts w:ascii="Liberation Serif" w:hAnsi="Liberation Serif"/>
+        </w:rPr>
+        <w:t xml:space="preserve">. NNs can transform, categorize, produce, and otherwise process data to generate a form of AI. A specific kind of NN known as </w:t>
+      </w:r>
+      <w:r>
+        <w:rPr>
+          <w:rFonts w:ascii="Liberation Serif" w:hAnsi="Liberation Serif"/>
+        </w:rPr>
+        <w:t>recursive</w:t>
+      </w:r>
+      <w:r>
+        <w:rPr>
+          <w:rFonts w:ascii="Liberation Serif" w:hAnsi="Liberation Serif"/>
+        </w:rPr>
+        <w:t xml:space="preserve"> NNs </w:t>
+      </w:r>
+      <w:r>
+        <w:rPr>
+          <w:rFonts w:ascii="Liberation Serif" w:hAnsi="Liberation Serif"/>
+        </w:rPr>
+        <w:t>(RNN)</w:t>
+      </w:r>
+      <w:r>
+        <w:rPr>
+          <w:rFonts w:ascii="Liberation Serif" w:hAnsi="Liberation Serif"/>
+        </w:rPr>
+        <w:t xml:space="preserve"> are particularly capable of working with textual data, </w:t>
+      </w:r>
+      <w:r>
+        <w:rPr>
+          <w:rFonts w:ascii="Liberation Serif" w:hAnsi="Liberation Serif"/>
+        </w:rPr>
+        <w:t xml:space="preserve">as they can accept input of any length and </w:t>
+      </w:r>
+      <w:r>
+        <w:rPr>
+          <w:rFonts w:ascii="Liberation Serif" w:hAnsi="Liberation Serif"/>
+        </w:rPr>
+        <w:t>equally distribute attention across inputs.</w:t>
+      </w:r>
+      <w:r>
+        <w:rPr>
+          <w:rStyle w:val="FootnoteReference"/>
+          <w:rFonts w:ascii="Liberation Serif" w:hAnsi="Liberation Serif"/>
+        </w:rPr>
+        <w:footnoteReference w:id="11"/>
+      </w:r>
+      <w:r>
+        <w:rPr>
+          <w:rFonts w:ascii="Liberation Serif" w:hAnsi="Liberation Serif"/>
+        </w:rPr>
+        <w:t xml:space="preserve"> These models “learn” by establishing patterns between inputs and, considering their categories, can classify an input as belonging or not. I am currently developing an RNN that will accept a given text and determine, if relevant, the most likely Orthodox literary source, be that the Bible, apocrypha, or saints’ lives.</w:t>
+      </w:r>
+      <w:r>
+        <w:rPr>
+          <w:rStyle w:val="FootnoteReference"/>
+          <w:rFonts w:ascii="Liberation Serif" w:hAnsi="Liberation Serif"/>
+        </w:rPr>
+        <w:footnoteReference w:id="12"/>
+      </w:r>
+      <w:r>
+        <w:rPr>
+          <w:rFonts w:ascii="Liberation Serif" w:hAnsi="Liberation Serif"/>
+        </w:rPr>
+        <w:t xml:space="preserve"> For my purposes, I will use this RNN to find the most likely transposition objects in various texts as they are added to the Revolutionary Gospel database. It is my hope that with time, the program will be increasingly acute in its assessment and enable future researchers to crack the code of Gor’kii’s (and other Russians’) affinity to Orthodoxy as </w:t>
+      </w:r>
+      <w:r>
+        <w:rPr>
+          <w:rFonts w:ascii="Liberation Serif" w:hAnsi="Liberation Serif"/>
+        </w:rPr>
+        <w:t>a lens for the past, present, and future.</w:t>
       </w:r>
     </w:p>
     <w:p>
@@ -1401,7 +1578,7 @@
   <w:comment w:id="1" w:author="Clowes, Edith W (eec3c)" w:date="2024-05-02T11:26:31Z" w:initials="C(">
     <w:p>
       <w:pPr>
-        <w:overflowPunct w:val="false"/>
+        <w:overflowPunct w:val="true"/>
         <w:spacing w:lineRule="auto" w:line="240" w:before="0" w:after="0"/>
         <w:rPr/>
       </w:pPr>
@@ -1415,7 +1592,7 @@
     </w:p>
     <w:p>
       <w:pPr>
-        <w:overflowPunct w:val="false"/>
+        <w:overflowPunct w:val="true"/>
         <w:spacing w:lineRule="auto" w:line="240" w:before="0" w:after="0"/>
         <w:rPr/>
       </w:pPr>
@@ -1428,7 +1605,7 @@
     </w:p>
     <w:p>
       <w:pPr>
-        <w:overflowPunct w:val="false"/>
+        <w:overflowPunct w:val="true"/>
         <w:spacing w:lineRule="auto" w:line="240" w:before="0" w:after="0"/>
         <w:rPr/>
       </w:pPr>
@@ -1444,7 +1621,7 @@
   <w:comment w:id="0" w:author="Clowes, Edith W (eec3c)" w:date="2024-09-22T10:11:36Z" w:initials="C(">
     <w:p>
       <w:pPr>
-        <w:overflowPunct w:val="false"/>
+        <w:overflowPunct w:val="true"/>
         <w:spacing w:lineRule="auto" w:line="240" w:before="0" w:after="0"/>
         <w:rPr/>
       </w:pPr>
@@ -1500,7 +1677,31 @@
       </w:r>
       <w:r>
         <w:rPr/>
-        <w:t xml:space="preserve">The underlying programming code for this project as described in this chapter is available at </w:t>
+        <w:t xml:space="preserve">The underlying programming </w:t>
+      </w:r>
+      <w:r>
+        <w:rPr/>
+        <w:t>(“</w:t>
+      </w:r>
+      <w:r>
+        <w:rPr/>
+        <w:t>co</w:t>
+      </w:r>
+      <w:r>
+        <w:rPr/>
+        <w:t>d</w:t>
+      </w:r>
+      <w:r>
+        <w:rPr/>
+        <w:t>e”</w:t>
+      </w:r>
+      <w:r>
+        <w:rPr/>
+        <w:t>)</w:t>
+      </w:r>
+      <w:r>
+        <w:rPr/>
+        <w:t xml:space="preserve"> for this project as described in this chapter is available at </w:t>
       </w:r>
       <w:hyperlink r:id="rId1">
         <w:r>
@@ -1756,6 +1957,61 @@
       <w:r>
         <w:rPr/>
         <w:t>, to go by foot.</w:t>
+      </w:r>
+    </w:p>
+  </w:footnote>
+  <w:footnote w:id="11">
+    <w:p>
+      <w:pPr>
+        <w:pStyle w:val="FootnoteText"/>
+        <w:rPr/>
+      </w:pPr>
+      <w:r>
+        <w:rPr>
+          <w:rStyle w:val="FootnoteCharacters"/>
+        </w:rPr>
+        <w:footnoteRef/>
+      </w:r>
+      <w:r>
+        <w:rPr/>
+        <w:t xml:space="preserve"> </w:t>
+      </w:r>
+      <w:r>
+        <w:rPr/>
+        <w:t xml:space="preserve">Richard Socher et al., “Parsing Natural Scenes and Natural Language with Recursive Neural Networks,” in </w:t>
+      </w:r>
+      <w:r>
+        <w:rPr>
+          <w:i/>
+          <w:iCs/>
+        </w:rPr>
+        <w:t>Proceedings of the 28th International Conference on Machine Learning</w:t>
+      </w:r>
+      <w:r>
+        <w:rPr/>
+        <w:t xml:space="preserve"> (Bellvue, WA, 2011).</w:t>
+      </w:r>
+    </w:p>
+  </w:footnote>
+  <w:footnote w:id="12">
+    <w:p>
+      <w:pPr>
+        <w:pStyle w:val="FootnoteText"/>
+        <w:rPr/>
+      </w:pPr>
+      <w:r>
+        <w:rPr>
+          <w:rStyle w:val="FootnoteCharacters"/>
+        </w:rPr>
+        <w:footnoteRef/>
+      </w:r>
+      <w:r>
+        <w:rPr/>
+        <w:t xml:space="preserve"> </w:t>
+      </w:r>
+      <w:r>
+        <w:rPr/>
+        <w:t>The irony of employing “artificial intelligence” in Humanities and Social Sciences research is not lost on me. STEM’s use of AI is unextraordinary, but there is an inherent tension between AI and human-oriented scholarship.</w:t>
       </w:r>
     </w:p>
   </w:footnote>
@@ -1785,7 +2041,7 @@
     <w:pPr>
       <w:widowControl/>
       <w:suppressAutoHyphens w:val="true"/>
-      <w:overflowPunct w:val="true"/>
+      <w:overflowPunct w:val="false"/>
       <w:bidi w:val="0"/>
       <w:spacing w:lineRule="auto" w:line="276" w:before="0" w:after="160"/>
       <w:jc w:val="left"/>
@@ -1808,10 +2064,6 @@
     <w:pPr>
       <w:keepNext w:val="true"/>
       <w:keepLines/>
-      <w:numPr>
-        <w:ilvl w:val="0"/>
-        <w:numId w:val="0"/>
-      </w:numPr>
       <w:spacing w:before="360" w:after="80"/>
       <w:outlineLvl w:val="0"/>
     </w:pPr>
@@ -1831,10 +2083,6 @@
     <w:pPr>
       <w:keepNext w:val="true"/>
       <w:keepLines/>
-      <w:numPr>
-        <w:ilvl w:val="0"/>
-        <w:numId w:val="0"/>
-      </w:numPr>
       <w:spacing w:before="160" w:after="80"/>
       <w:outlineLvl w:val="1"/>
     </w:pPr>
@@ -1854,10 +2102,6 @@
     <w:pPr>
       <w:keepNext w:val="true"/>
       <w:keepLines/>
-      <w:numPr>
-        <w:ilvl w:val="0"/>
-        <w:numId w:val="0"/>
-      </w:numPr>
       <w:spacing w:before="160" w:after="80"/>
       <w:outlineLvl w:val="2"/>
     </w:pPr>
@@ -1877,10 +2121,6 @@
     <w:pPr>
       <w:keepNext w:val="true"/>
       <w:keepLines/>
-      <w:numPr>
-        <w:ilvl w:val="0"/>
-        <w:numId w:val="0"/>
-      </w:numPr>
       <w:spacing w:before="80" w:after="40"/>
       <w:outlineLvl w:val="3"/>
     </w:pPr>
@@ -1900,10 +2140,6 @@
     <w:pPr>
       <w:keepNext w:val="true"/>
       <w:keepLines/>
-      <w:numPr>
-        <w:ilvl w:val="0"/>
-        <w:numId w:val="0"/>
-      </w:numPr>
       <w:spacing w:before="80" w:after="40"/>
       <w:outlineLvl w:val="4"/>
     </w:pPr>
@@ -1921,10 +2157,6 @@
     <w:pPr>
       <w:keepNext w:val="true"/>
       <w:keepLines/>
-      <w:numPr>
-        <w:ilvl w:val="0"/>
-        <w:numId w:val="0"/>
-      </w:numPr>
       <w:spacing w:before="40" w:after="0"/>
       <w:outlineLvl w:val="5"/>
     </w:pPr>
@@ -1944,10 +2176,6 @@
     <w:pPr>
       <w:keepNext w:val="true"/>
       <w:keepLines/>
-      <w:numPr>
-        <w:ilvl w:val="0"/>
-        <w:numId w:val="0"/>
-      </w:numPr>
       <w:spacing w:before="40" w:after="0"/>
       <w:outlineLvl w:val="6"/>
     </w:pPr>
@@ -1965,10 +2193,6 @@
     <w:pPr>
       <w:keepNext w:val="true"/>
       <w:keepLines/>
-      <w:numPr>
-        <w:ilvl w:val="0"/>
-        <w:numId w:val="0"/>
-      </w:numPr>
       <w:spacing w:before="0" w:after="0"/>
       <w:outlineLvl w:val="7"/>
     </w:pPr>
@@ -1988,10 +2212,6 @@
     <w:pPr>
       <w:keepNext w:val="true"/>
       <w:keepLines/>
-      <w:numPr>
-        <w:ilvl w:val="0"/>
-        <w:numId w:val="0"/>
-      </w:numPr>
       <w:spacing w:before="0" w:after="0"/>
       <w:outlineLvl w:val="8"/>
     </w:pPr>
@@ -2177,15 +2397,15 @@
       <w:spacing w:val="5"/>
     </w:rPr>
   </w:style>
+  <w:style w:type="character" w:styleId="FootnoteCharactersuser">
+    <w:name w:val="Footnote Characters (user)"/>
+    <w:qFormat/>
+    <w:rPr>
+      <w:vertAlign w:val="superscript"/>
+    </w:rPr>
+  </w:style>
   <w:style w:type="character" w:styleId="FootnoteCharacters">
     <w:name w:val="Footnote Characters"/>
-    <w:qFormat/>
-    <w:rPr>
-      <w:vertAlign w:val="superscript"/>
-    </w:rPr>
-  </w:style>
-  <w:style w:type="character" w:styleId="FootnoteCharactersuser">
-    <w:name w:val="Footnote Characters (user)"/>
     <w:qFormat/>
     <w:rPr>
       <w:vertAlign w:val="superscript"/>
@@ -2207,6 +2427,13 @@
       <w:szCs w:val="20"/>
     </w:rPr>
   </w:style>
+  <w:style w:type="character" w:styleId="EndnoteCharactersuser">
+    <w:name w:val="Endnote Characters (user)"/>
+    <w:qFormat/>
+    <w:rPr>
+      <w:vertAlign w:val="superscript"/>
+    </w:rPr>
+  </w:style>
   <w:style w:type="character" w:styleId="EndnoteCharacters">
     <w:name w:val="Endnote Characters"/>
     <w:qFormat/>
@@ -2214,13 +2441,6 @@
       <w:vertAlign w:val="superscript"/>
     </w:rPr>
   </w:style>
-  <w:style w:type="character" w:styleId="EndnoteCharactersuser">
-    <w:name w:val="Endnote Characters (user)"/>
-    <w:qFormat/>
-    <w:rPr>
-      <w:vertAlign w:val="superscript"/>
-    </w:rPr>
-  </w:style>
   <w:style w:type="character" w:styleId="EndnoteReference">
     <w:name w:val="endnote reference"/>
     <w:rPr>
@@ -2239,8 +2459,8 @@
     <w:qFormat/>
     <w:rPr/>
   </w:style>
-  <w:style w:type="character" w:styleId="Bullets">
-    <w:name w:val="Bullets"/>
+  <w:style w:type="character" w:styleId="Bulletsuser">
+    <w:name w:val="Bullets (user)"/>
     <w:qFormat/>
     <w:rPr>
       <w:rFonts w:ascii="OpenSymbol" w:hAnsi="OpenSymbol" w:eastAsia="OpenSymbol" w:cs="OpenSymbol"/>
@@ -2386,8 +2606,8 @@
       <w:szCs w:val="20"/>
     </w:rPr>
   </w:style>
-  <w:style w:type="paragraph" w:styleId="BlockQuotation">
-    <w:name w:val="Block Quotation"/>
+  <w:style w:type="paragraph" w:styleId="BlockQuotationuser">
+    <w:name w:val="Block Quotation (user)"/>
     <w:basedOn w:val="Normal"/>
     <w:qFormat/>
     <w:pPr>
@@ -2439,8 +2659,8 @@
     <w:pPr/>
     <w:rPr/>
   </w:style>
-  <w:style w:type="paragraph" w:styleId="FrameContentsuser">
-    <w:name w:val="Frame Contents (user)"/>
+  <w:style w:type="paragraph" w:styleId="FrameContents">
+    <w:name w:val="Frame Contents"/>
     <w:basedOn w:val="Normal"/>
     <w:qFormat/>
     <w:pPr/>

</xml_diff>